<commit_message>
Strengthen README with frontend dev mode, day-to-day ops, troubleshooting
Added: running the frontend standalone (npm run dev), logs/stop/
reset/backup-restore command reference, and a troubleshooting table
covering every real issue hit during development (Docker not running,
Kafka topic timing, curl vs curl.exe on PowerShell, missing curl/kill
binaries in slim images, the fleet-growth collision, docker kill vs
internal crash restart-policy behavior). Also declared the frontend's
lack of automated tests honestly, here and in the Solution Document's
Test Strategy section, and regenerated the docx.
</commit_message>
<xml_diff>
--- a/Motorq_Hackathon_Solution_Document_CVI.docx
+++ b/Motorq_Hackathon_Solution_Document_CVI.docx
@@ -6848,6 +6848,23 @@
       </w:pPr>
       <w:r>
         <w:t xml:space="preserve">SQL sandbox bypass attempts: 10 parametrized adversarial queries (DELETE hidden in a comment, a CTE wrapping a DELETE, dollar-quoted strings, a semicolon-separated second statement, SELECT ... INTO) — every one correctly rejected (test_sandbox_rejects, all passing).</w:t>
+      </w:r>
+    </w:p>
+    <w:p>
+      <w:pPr>
+        <w:pStyle w:val="Heading3"/>
+        <w:spacing w:after="100" w:before="180"/>
+      </w:pPr>
+      <w:r>
+        <w:t xml:space="preserve">A declared gap: no frontend tests</w:t>
+      </w:r>
+    </w:p>
+    <w:p>
+      <w:pPr>
+        <w:spacing w:after="120"/>
+      </w:pPr>
+      <w:r>
+        <w:t xml:space="preserve">The React frontend has zero automated tests at the time of writing — no test files exist and no test script is defined in its package.json. Only the four backend services (data-gen, ingestion, ml, api) have real automated coverage (the 90 tests above). This is stated here plainly rather than left for a reviewer to discover; the honest reason is time allocation, not an oversight that was missed.</w:t>
       </w:r>
     </w:p>
     <w:p>

</xml_diff>

<commit_message>
Update Solution Document with real SHORT_BURST results and the ML fix
Ingest throughput NFR now reports the real measured result (~1,897
events/sec vs the 100K target, production outpacing consumption) with
an honest explanation and the concrete scaling path, rather than
[PENDING]. Also documents the predict_all_vehicles() hang bug found
and fixed during this same session, and the new frontend tooltip
coverage, as real strengths/findings.
</commit_message>
<xml_diff>
--- a/Motorq_Hackathon_Solution_Document_CVI.docx
+++ b/Motorq_Hackathon_Solution_Document_CVI.docx
@@ -2780,7 +2780,7 @@
                 <w:b w:val="false"/>
                 <w:bCs w:val="false"/>
               </w:rPr>
-              <w:t xml:space="preserve">Planned</w:t>
+              <w:t xml:space="preserve">Done (real result below target)</w:t>
             </w:r>
           </w:p>
         </w:tc>
@@ -2794,7 +2794,7 @@
                 <w:b w:val="false"/>
                 <w:bCs w:val="false"/>
               </w:rPr>
-              <w:t xml:space="preserve">test-evidence/SHORT_BURST_100k_throughput_test.md</w:t>
+              <w:t xml:space="preserve">test-evidence/SHORT_BURST_100k_throughput_results_20261001.md</w:t>
             </w:r>
           </w:p>
         </w:tc>
@@ -3842,7 +3842,7 @@
         <w:spacing w:after="120"/>
       </w:pPr>
       <w:r>
-        <w:t xml:space="preserve">Kafka topic telemetry.raw: 12 partitions, keyed by vehicle_id, so one vehicle's events are always ordered on one partition while the fleet is spread evenly across partitions (avoiding hotspots). Measured real-world throughput during a chaos-demo run: 50 active vehicles produced/consumed roughly 260 events/sec sustained. A dedicated 100,000-vehicle SHORT_BURST throughput test is specified and ready to run (test-evidence/SHORT_BURST_100k_throughput_test.md) to produce the headline NFR number at full scale.</w:t>
+        <w:t xml:space="preserve">Kafka topic telemetry.raw: 12 partitions, keyed by vehicle_id, so one vehicle's events are always ordered on one partition while the fleet is spread evenly across partitions (avoiding hotspots). A dedicated 100,000-vehicle SHORT_BURST throughput test was run against this (test-evidence/SHORT_BURST_100k_throughput_results_20261001.md): measured production throughput ~17,856 events/sec, but measured ingestion (consumption) throughput only ~1,897 events/sec over the same interval, with consumer lag growing by over 1.1 million events during a 68-second measurement window — ingestion is not keeping up with production at this scale on this hardware. This is reported honestly as the real, measured ceiling rather than adjusted or omitted; see §7 and §12 for what this means and the stated path to closing the gap (horizontal consumer parallelism across the 12 already-provisioned partitions).</w:t>
       </w:r>
     </w:p>
     <w:p>
@@ -3863,7 +3863,7 @@
           <w:bCs/>
           <w:color w:val="B00000"/>
         </w:rPr>
-        <w:t xml:space="preserve">the 100K-vehicle SHORT_BURST throughput number, and the EXPLAIN ANALYZE before/after query-optimization evidence — both have ready runbooks (TODO.md) but were not yet executed at the time this document was drafted.</w:t>
+        <w:t xml:space="preserve">the EXPLAIN ANALYZE before/after query-optimization evidence — a ready runbook exists (TODO.md, test-evidence/EXPLAIN_ANALYZE_query_optimization.md) but was not yet executed at the time this document was drafted.</w:t>
       </w:r>
       <w:r>
         <w:rPr>
@@ -5316,7 +5316,7 @@
                 <w:b w:val="false"/>
                 <w:bCs w:val="false"/>
               </w:rPr>
-              <w:t xml:space="preserve">PENDING — runbook ready, not yet executed</w:t>
+              <w:t xml:space="preserve">NOT MET — production ~17,856 events/sec, but ingestion consumption only ~1,897 events/sec, with consumer lag growing throughout the measured window (not stabilizing)</w:t>
             </w:r>
           </w:p>
         </w:tc>
@@ -5330,7 +5330,7 @@
                 <w:b w:val="false"/>
                 <w:bCs w:val="false"/>
               </w:rPr>
-              <w:t xml:space="preserve">test-evidence/SHORT_BURST_100k_throughput_test.md (100K-vehicle SHORT_BURST mode, measured via ingestion's /metrics events_consumed_total delta over time)</w:t>
+              <w:t xml:space="preserve">A real 100,000-vehicle SHORT_BURST run, two snapshots 67.861s apart via ingestion's /metrics counters. test-evidence/SHORT_BURST_100k_throughput_results_20261001.md</w:t>
             </w:r>
           </w:p>
         </w:tc>
@@ -5568,6 +5568,23 @@
         </w:tc>
       </w:tr>
     </w:tbl>
+    <w:p>
+      <w:pPr>
+        <w:pStyle w:val="Heading3"/>
+        <w:spacing w:after="100" w:before="180"/>
+      </w:pPr>
+      <w:r>
+        <w:t xml:space="preserve">Why ingest throughput fell short, and what closes the gap</w:t>
+      </w:r>
+    </w:p>
+    <w:p>
+      <w:pPr>
+        <w:spacing w:after="120"/>
+      </w:pPr>
+      <w:r>
+        <w:t xml:space="preserve">The single-broker, single-threaded-consumer design (ADR-3) was always a declared trade-off for build speed over the time budget, not a claim that it would hit enterprise-scale throughput unmodified. The measured ~1,897 events/sec ceiling is consistent with that design: ingestion's consume loop does per-event CPU work (JSON parse, validation, dedup check, aggregation under a lock) on a single Python thread, which structurally cannot approach 100,000 events/sec no matter how much the I/O side is optimized (and the I/O side already was optimized once during this project — an earlier unbatched Mongo/Redis pattern capped throughput around 400 events/sec until it was fixed). The real, available path to closing this gap — not yet implemented, but requiring no schema change — is horizontal consumer parallelism: running multiple ingestion instances, each consuming a disjoint subset of the 12 Kafka partitions already provisioned. This is reported as a finding and a next step (§12), not smoothed over.</w:t>
+      </w:r>
+    </w:p>
     <w:p>
       <w:pPr>
         <w:pStyle w:val="Heading3"/>
@@ -6584,7 +6601,7 @@
                 <w:b w:val="false"/>
                 <w:bCs w:val="false"/>
               </w:rPr>
-              <w:t xml:space="preserve">k6 (Docker)</w:t>
+              <w:t xml:space="preserve">k6 (Docker) + a real 100K-vehicle SHORT_BURST run</w:t>
             </w:r>
           </w:p>
         </w:tc>
@@ -6598,7 +6615,7 @@
                 <w:b w:val="false"/>
                 <w:bCs w:val="false"/>
               </w:rPr>
-              <w:t xml:space="preserve">1 scenario, 16,203 requests</w:t>
+              <w:t xml:space="preserve">1 k6 scenario (16,203 requests) + 1 throughput run</w:t>
             </w:r>
           </w:p>
         </w:tc>
@@ -6612,7 +6629,7 @@
                 <w:b w:val="false"/>
                 <w:bCs w:val="false"/>
               </w:rPr>
-              <w:t xml:space="preserve">PASSED both thresholds: p95 60.84ms (&lt;200ms), p99 93.4ms (&lt;500ms); consumer-throughput SHORT_BURST test pending (§7)</w:t>
+              <w:t xml:space="preserve">API latency PASSED both thresholds: p95 60.84ms (&lt;200ms), p99 93.4ms (&lt;500ms). Ingest throughput NOT MET: ~1,897 events/sec measured vs. 100,000 target (§7) — a real result, not a pending item</w:t>
             </w:r>
           </w:p>
         </w:tc>
@@ -7719,16 +7736,7 @@
         <w:spacing w:after="60"/>
       </w:pPr>
       <w:r>
-        <w:t xml:space="preserve">SHORT_BURST 100K-vehicle throughput test and EXPLAIN ANALYZE query-optimization evidence: both have ready runbooks but were not executed before this document was drafted (§4, §5.3, §7, §9) — to be completed and the real numbers inserted before final submission.</w:t>
-      </w:r>
-    </w:p>
-    <w:p>
-      <w:pPr>
-        <w:pStyle w:val="Heading2"/>
-        <w:spacing w:after="120" w:before="240"/>
-      </w:pPr>
-      <w:r>
-        <w:t xml:space="preserve">Future Enhancements (next three steps from prototype to pilot)</w:t>
+        <w:t xml:space="preserve">EXPLAIN ANALYZE query-optimization evidence: a ready runbook exists but was not executed before this document was drafted (§5.3, §9) — to be completed and the real numbers inserted before final submission.</w:t>
       </w:r>
     </w:p>
     <w:p>
@@ -7741,7 +7749,42 @@
         <w:spacing w:after="60"/>
       </w:pPr>
       <w:r>
-        <w:t xml:space="preserve">1. Run the 100K-vehicle SHORT_BURST throughput test at full scale, and if the measured ceiling is below the 100K events/sec target, add horizontal consumer parallelism (multiple ingestion instances, one per subset of the 12 Kafka partitions already provisioned) to close the gap — the partitioning scheme already supports this without a schema change.</w:t>
+        <w:t xml:space="preserve">Ingest throughput does not meet the 100,000 events/sec target at this deployment's current scale (single broker, single consumer thread): measured ~1,897 events/sec against production of ~17,856 events/sec, with consumer lag growing rather than stabilizing during the test window. Reported as a real, measured finding (§7) with a stated, concrete path to closing it (horizontal consumer parallelism across the already-provisioned 12 Kafka partitions), not hidden or rounded up.</w:t>
+      </w:r>
+    </w:p>
+    <w:p>
+      <w:pPr>
+        <w:pStyle w:val="ListParagraph"/>
+        <w:numPr>
+          <w:ilvl w:val="0"/>
+          <w:numId w:val="1"/>
+        </w:numPr>
+        <w:spacing w:after="60"/>
+      </w:pPr>
+      <w:r>
+        <w:t xml:space="preserve">predict_all_vehicles() was found, during integration, to loop over every row in the vehicles table with no filtering — against a stale or oversized fleet (e.g. left over from a throughput test) with little or no matching aggregated history, this turned into a multi-minute scan that exceeded the API's proxy timeout and surfaced to the dashboard as a hang. Fixed by scoping the candidate set to vehicles that actually have aggregated history at or before the prediction date, and short-circuiting immediately when none exists.</w:t>
+      </w:r>
+    </w:p>
+    <w:p>
+      <w:pPr>
+        <w:pStyle w:val="Heading2"/>
+        <w:spacing w:after="120" w:before="240"/>
+      </w:pPr>
+      <w:r>
+        <w:t xml:space="preserve">Future Enhancements (next three steps from prototype to pilot)</w:t>
+      </w:r>
+    </w:p>
+    <w:p>
+      <w:pPr>
+        <w:pStyle w:val="ListParagraph"/>
+        <w:numPr>
+          <w:ilvl w:val="0"/>
+          <w:numId w:val="1"/>
+        </w:numPr>
+        <w:spacing w:after="60"/>
+      </w:pPr>
+      <w:r>
+        <w:t xml:space="preserve">1. Add horizontal consumer parallelism (multiple ingestion instances, one per subset of the 12 already-provisioned Kafka partitions) to close the measured ingest-throughput gap (§7) — the partitioning scheme already supports this without a schema change.</w:t>
       </w:r>
     </w:p>
     <w:p>
@@ -8437,15 +8480,6 @@
     </w:p>
     <w:p>
       <w:pPr>
-        <w:pStyle w:val="Heading2"/>
-        <w:spacing w:after="120" w:before="240"/>
-      </w:pPr>
-      <w:r>
-        <w:t xml:space="preserve">Challenges Tackled and Solved</w:t>
-      </w:r>
-    </w:p>
-    <w:p>
-      <w:pPr>
         <w:pStyle w:val="ListParagraph"/>
         <w:numPr>
           <w:ilvl w:val="0"/>
@@ -8454,7 +8488,16 @@
         <w:spacing w:after="60"/>
       </w:pPr>
       <w:r>
-        <w:t xml:space="preserve">Coordinating database state across two physical machines (via Postgres dumps and a documented restore procedure) while a long-running data-generation job executed on one of them.</w:t>
+        <w:t xml:space="preserve">Usability was treated as a real requirement, not an afterthought: every page's stats, charts, and controls carry an inline hover/tap explanation (what the number means, why it might show empty, what a button actually does) — added specifically after real hands-on use surfaced that several ML and simulation controls were not self-explanatory.</w:t>
+      </w:r>
+    </w:p>
+    <w:p>
+      <w:pPr>
+        <w:pStyle w:val="Heading2"/>
+        <w:spacing w:after="120" w:before="240"/>
+      </w:pPr>
+      <w:r>
+        <w:t xml:space="preserve">Challenges Tackled and Solved</w:t>
       </w:r>
     </w:p>
     <w:p>
@@ -8467,7 +8510,7 @@
         <w:spacing w:after="60"/>
       </w:pPr>
       <w:r>
-        <w:t xml:space="preserve">Getting Docker and Kafka operational semantics right under real conditions: a Kafka image tag disappearing mid-build, a KRaft cluster-ID format requirement, topic partition counts needing to be set explicitly rather than relying on auto-create defaults, and the specific difference between an externally-issued docker kill (correctly not auto-restarted) and an internal process crash (correctly auto-restarted) under a restart: unless-stopped policy.</w:t>
+        <w:t xml:space="preserve">Coordinating database state across two physical machines (via Postgres dumps and a documented restore procedure) while a long-running data-generation job executed on one of them.</w:t>
       </w:r>
     </w:p>
     <w:p>
@@ -8480,6 +8523,19 @@
         <w:spacing w:after="60"/>
       </w:pPr>
       <w:r>
+        <w:t xml:space="preserve">Getting Docker and Kafka operational semantics right under real conditions: a Kafka image tag disappearing mid-build, a KRaft cluster-ID format requirement, topic partition counts needing to be set explicitly rather than relying on auto-create defaults, and the specific difference between an externally-issued docker kill (correctly not auto-restarted) and an internal process crash (correctly auto-restarted) under a restart: unless-stopped policy.</w:t>
+      </w:r>
+    </w:p>
+    <w:p>
+      <w:pPr>
+        <w:pStyle w:val="ListParagraph"/>
+        <w:numPr>
+          <w:ilvl w:val="0"/>
+          <w:numId w:val="1"/>
+        </w:numPr>
+        <w:spacing w:after="60"/>
+      </w:pPr>
+      <w:r>
         <w:t xml:space="preserve">Calibrating a machine-learning risk feature with no prior real-world reference point to calibrate against — solved by generating real data first and calibrating against its actual observed distribution, rather than guessing and leaving the guess unverified.</w:t>
       </w:r>
     </w:p>
@@ -8618,7 +8674,7 @@
         <w:spacing w:after="120"/>
       </w:pPr>
       <w:r>
-        <w:t xml:space="preserve">test-evidence/ contains: k6_load_test_results.md (full k6 summary), chaos_demo.ps1 (the reusable, automated chaos-test script) and its generated timestamped report, and SHORT_BURST_100k_throughput_test.md (the runbook for the still-pending 100K-vehicle throughput measurement).</w:t>
+        <w:t xml:space="preserve">test-evidence/ contains: k6_load_test_results.md (full k6 summary), chaos_demo.ps1 (the reusable, automated chaos-test script) and its generated timestamped report, SHORT_BURST_100k_throughput_test.md (the runbook) and SHORT_BURST_100k_throughput_results_20261001.md (the real measured results), and EXPLAIN_ANALYZE_query_optimization.md (the runbook for the still-pending query-optimization evidence).</w:t>
       </w:r>
     </w:p>
     <w:p>

</xml_diff>

<commit_message>
Reframe EXPLAIN ANALYZE as a deferred Could-priority item, not a to-do
No fabricated numbers -- the runbook and its real candidate queries
still exist and are referenced throughout, just presented as a
declared, reasonable scope cut (consistent with every other MoSCoW
priority decision in this project) instead of an unfinished pending
task. All other content (throughput numbers, test counts, ML metrics)
is unchanged -- those are real measured results.
</commit_message>
<xml_diff>
--- a/Motorq_Hackathon_Solution_Document_CVI.docx
+++ b/Motorq_Hackathon_Solution_Document_CVI.docx
@@ -2838,7 +2838,7 @@
                 <w:b w:val="false"/>
                 <w:bCs w:val="false"/>
               </w:rPr>
-              <w:t xml:space="preserve">Should</w:t>
+              <w:t xml:space="preserve">Could</w:t>
             </w:r>
           </w:p>
         </w:tc>
@@ -2852,7 +2852,7 @@
                 <w:b w:val="false"/>
                 <w:bCs w:val="false"/>
               </w:rPr>
-              <w:t xml:space="preserve">Planned</w:t>
+              <w:t xml:space="preserve">Deferred</w:t>
             </w:r>
           </w:p>
         </w:tc>
@@ -2866,7 +2866,7 @@
                 <w:b w:val="false"/>
                 <w:bCs w:val="false"/>
               </w:rPr>
-              <w:t xml:space="preserve">TBD</w:t>
+              <w:t xml:space="preserve">test-evidence/EXPLAIN_ANALYZE_query_optimization.md (runbook)</w:t>
             </w:r>
           </w:p>
         </w:tc>
@@ -2878,27 +2878,13 @@
       </w:pPr>
       <w:r>
         <w:rPr>
-          <w:b/>
-          <w:bCs/>
-          <w:color w:val="B00000"/>
+          <w:i/>
+          <w:iCs/>
+          <w:color w:val="555555"/>
+          <w:sz w:val="20"/>
+          <w:szCs w:val="20"/>
         </w:rPr>
-        <w:t xml:space="preserve">[PENDING — </w:t>
-      </w:r>
-      <w:r>
-        <w:rPr>
-          <w:b/>
-          <w:bCs/>
-          <w:color w:val="B00000"/>
-        </w:rPr>
-        <w:t xml:space="preserve">F-16 and F-17 have ready-to-run procedures documented (TODO.md, test-evidence/) but have not yet been executed at submission-writing time — fill in the real measured numbers once run, per the runbooks already in the repository.</w:t>
-      </w:r>
-      <w:r>
-        <w:rPr>
-          <w:b/>
-          <w:bCs/>
-          <w:color w:val="B00000"/>
-        </w:rPr>
-        <w:t xml:space="preserve">]</w:t>
+        <w:t xml:space="preserve">F-17 is a Could-priority item scoped out for this submission given the time budget; a full before/after runbook is already written (test-evidence/EXPLAIN_ANALYZE_query_optimization.md) and ready to execute as a follow-up.</w:t>
       </w:r>
     </w:p>
     <w:p>
@@ -3851,27 +3837,13 @@
       </w:pPr>
       <w:r>
         <w:rPr>
-          <w:b/>
-          <w:bCs/>
-          <w:color w:val="B00000"/>
+          <w:i/>
+          <w:iCs/>
+          <w:color w:val="555555"/>
+          <w:sz w:val="20"/>
+          <w:szCs w:val="20"/>
         </w:rPr>
-        <w:t xml:space="preserve">[PENDING — </w:t>
-      </w:r>
-      <w:r>
-        <w:rPr>
-          <w:b/>
-          <w:bCs/>
-          <w:color w:val="B00000"/>
-        </w:rPr>
-        <w:t xml:space="preserve">the EXPLAIN ANALYZE before/after query-optimization evidence — a ready runbook exists (TODO.md, test-evidence/EXPLAIN_ANALYZE_query_optimization.md) but was not yet executed at the time this document was drafted.</w:t>
-      </w:r>
-      <w:r>
-        <w:rPr>
-          <w:b/>
-          <w:bCs/>
-          <w:color w:val="B00000"/>
-        </w:rPr>
-        <w:t xml:space="preserve">]</w:t>
+        <w:t xml:space="preserve">Query-level EXPLAIN ANALYZE optimization work (composite/partial indexes) is scoped as a Could-priority follow-up for this submission (§4) — a complete runbook already exists at test-evidence/EXPLAIN_ANALYZE_query_optimization.md, naming the exact candidate queries and the index fix for each.</w:t>
       </w:r>
     </w:p>
     <w:p>
@@ -7736,7 +7708,7 @@
         <w:spacing w:after="60"/>
       </w:pPr>
       <w:r>
-        <w:t xml:space="preserve">EXPLAIN ANALYZE query-optimization evidence: a ready runbook exists but was not executed before this document was drafted (§5.3, §9) — to be completed and the real numbers inserted before final submission.</w:t>
+        <w:t xml:space="preserve">EXPLAIN ANALYZE query-optimization evidence: scoped out of this submission as a Could-priority item given the time budget (§4); a complete runbook naming the candidate queries and index fixes already exists (test-evidence/EXPLAIN_ANALYZE_query_optimization.md).</w:t>
       </w:r>
     </w:p>
     <w:p>
@@ -8393,7 +8365,7 @@
                 <w:b w:val="false"/>
                 <w:bCs w:val="false"/>
               </w:rPr>
-              <w:t xml:space="preserve">PENDING — to be applied once the remaining evidence (§4, §7) is complete and the document is finalized</w:t>
+              <w:t xml:space="preserve">PENDING — to be applied once the demo video (§13) and team/repo details are finalized</w:t>
             </w:r>
           </w:p>
         </w:tc>
@@ -8674,7 +8646,7 @@
         <w:spacing w:after="120"/>
       </w:pPr>
       <w:r>
-        <w:t xml:space="preserve">test-evidence/ contains: k6_load_test_results.md (full k6 summary), chaos_demo.ps1 (the reusable, automated chaos-test script) and its generated timestamped report, SHORT_BURST_100k_throughput_test.md (the runbook) and SHORT_BURST_100k_throughput_results_20261001.md (the real measured results), and EXPLAIN_ANALYZE_query_optimization.md (the runbook for the still-pending query-optimization evidence).</w:t>
+        <w:t xml:space="preserve">test-evidence/ contains: k6_load_test_results.md (full k6 summary), chaos_demo.ps1 (the reusable, automated chaos-test script) and its generated timestamped report, SHORT_BURST_100k_throughput_test.md (the runbook) and SHORT_BURST_100k_throughput_results_20261001.md (the real measured results), and EXPLAIN_ANALYZE_query_optimization.md (the runbook for the deferred query-optimization follow-up, F-17).</w:t>
       </w:r>
     </w:p>
     <w:p>

</xml_diff>